<commit_message>
Point de restauration interface batiments prepares
</commit_message>
<xml_diff>
--- a/KBase-docs/NOTE_TECHNIQUE_02_SYNTHESE_IMPORT_KOBO_G2M.docx
+++ b/KBase-docs/NOTE_TECHNIQUE_02_SYNTHESE_IMPORT_KOBO_G2M.docx
@@ -2754,10 +2754,17 @@
           <w:ilvl w:val="0"/>
           <w:numId w:val="1"/>
         </w:numPr>
+        <w:shd w:val="clear" w:color="auto" w:fill="FBE4D5" w:themeFill="accent2" w:themeFillTint="33"/>
         <w:spacing w:line="281" w:lineRule="auto"/>
         <w:ind w:left="714" w:hanging="357"/>
-      </w:pPr>
-      <w:r>
+        <w:rPr>
+          <w:color w:val="FF0000"/>
+        </w:rPr>
+      </w:pPr>
+      <w:r>
+        <w:rPr>
+          <w:color w:val="FF0000"/>
+        </w:rPr>
         <w:t>GPS absent ;</w:t>
       </w:r>
     </w:p>
@@ -2768,10 +2775,17 @@
           <w:ilvl w:val="0"/>
           <w:numId w:val="1"/>
         </w:numPr>
+        <w:shd w:val="clear" w:color="auto" w:fill="FBE4D5" w:themeFill="accent2" w:themeFillTint="33"/>
         <w:spacing w:line="281" w:lineRule="auto"/>
         <w:ind w:left="714" w:hanging="357"/>
-      </w:pPr>
-      <w:r>
+        <w:rPr>
+          <w:color w:val="FF0000"/>
+        </w:rPr>
+      </w:pPr>
+      <w:r>
+        <w:rPr>
+          <w:color w:val="FF0000"/>
+        </w:rPr>
         <w:t>GPS invalide ;</w:t>
       </w:r>
     </w:p>
@@ -2782,10 +2796,17 @@
           <w:ilvl w:val="0"/>
           <w:numId w:val="1"/>
         </w:numPr>
+        <w:shd w:val="clear" w:color="auto" w:fill="FBE4D5" w:themeFill="accent2" w:themeFillTint="33"/>
         <w:spacing w:line="281" w:lineRule="auto"/>
         <w:ind w:left="714" w:hanging="357"/>
-      </w:pPr>
-      <w:r>
+        <w:rPr>
+          <w:color w:val="FF0000"/>
+        </w:rPr>
+      </w:pPr>
+      <w:r>
+        <w:rPr>
+          <w:color w:val="FF0000"/>
+        </w:rPr>
         <w:t>agent non reconnu ;</w:t>
       </w:r>
     </w:p>
@@ -2796,24 +2817,40 @@
           <w:ilvl w:val="0"/>
           <w:numId w:val="1"/>
         </w:numPr>
+        <w:shd w:val="clear" w:color="auto" w:fill="FBE4D5" w:themeFill="accent2" w:themeFillTint="33"/>
         <w:spacing w:line="281" w:lineRule="auto"/>
         <w:ind w:left="714" w:hanging="357"/>
-      </w:pPr>
-      <w:r>
+        <w:rPr>
+          <w:color w:val="FF0000"/>
+        </w:rPr>
+      </w:pPr>
+      <w:r>
+        <w:rPr>
+          <w:color w:val="FF0000"/>
+        </w:rPr>
         <w:t>équipe non reconnue ;</w:t>
       </w:r>
-    </w:p>
-    <w:p>
-      <w:pPr>
-        <w:pStyle w:val="Paragraphedeliste"/>
-        <w:numPr>
-          <w:ilvl w:val="0"/>
-          <w:numId w:val="1"/>
-        </w:numPr>
+      <w:bookmarkStart w:id="0" w:name="_GoBack"/>
+      <w:bookmarkEnd w:id="0"/>
+    </w:p>
+    <w:p>
+      <w:pPr>
+        <w:pStyle w:val="Paragraphedeliste"/>
+        <w:numPr>
+          <w:ilvl w:val="0"/>
+          <w:numId w:val="1"/>
+        </w:numPr>
+        <w:shd w:val="clear" w:color="auto" w:fill="FBE4D5" w:themeFill="accent2" w:themeFillTint="33"/>
         <w:spacing w:line="281" w:lineRule="auto"/>
         <w:ind w:left="714" w:hanging="357"/>
-      </w:pPr>
-      <w:r>
+        <w:rPr>
+          <w:color w:val="FF0000"/>
+        </w:rPr>
+      </w:pPr>
+      <w:r>
+        <w:rPr>
+          <w:color w:val="FF0000"/>
+        </w:rPr>
         <w:t>sous-préfecture non reconnue ;</w:t>
       </w:r>
     </w:p>
@@ -2824,10 +2861,17 @@
           <w:ilvl w:val="0"/>
           <w:numId w:val="1"/>
         </w:numPr>
+        <w:shd w:val="clear" w:color="auto" w:fill="FBE4D5" w:themeFill="accent2" w:themeFillTint="33"/>
         <w:spacing w:line="281" w:lineRule="auto"/>
         <w:ind w:left="714" w:hanging="357"/>
-      </w:pPr>
-      <w:r>
+        <w:rPr>
+          <w:color w:val="FF0000"/>
+        </w:rPr>
+      </w:pPr>
+      <w:r>
+        <w:rPr>
+          <w:color w:val="FF0000"/>
+        </w:rPr>
         <w:t>incohérence entre territoire déclaré et coordonnées GPS ;</w:t>
       </w:r>
     </w:p>
@@ -2838,10 +2882,17 @@
           <w:ilvl w:val="0"/>
           <w:numId w:val="1"/>
         </w:numPr>
+        <w:shd w:val="clear" w:color="auto" w:fill="FBE4D5" w:themeFill="accent2" w:themeFillTint="33"/>
         <w:spacing w:line="281" w:lineRule="auto"/>
         <w:ind w:left="714" w:hanging="357"/>
-      </w:pPr>
-      <w:r>
+        <w:rPr>
+          <w:color w:val="FF0000"/>
+        </w:rPr>
+      </w:pPr>
+      <w:r>
+        <w:rPr>
+          <w:color w:val="FF0000"/>
+        </w:rPr>
         <w:t>doublon fonctionnel ;</w:t>
       </w:r>
     </w:p>
@@ -2852,10 +2903,17 @@
           <w:ilvl w:val="0"/>
           <w:numId w:val="1"/>
         </w:numPr>
+        <w:shd w:val="clear" w:color="auto" w:fill="FBE4D5" w:themeFill="accent2" w:themeFillTint="33"/>
         <w:spacing w:line="281" w:lineRule="auto"/>
         <w:ind w:left="714" w:hanging="357"/>
-      </w:pPr>
-      <w:r>
+        <w:rPr>
+          <w:color w:val="FF0000"/>
+        </w:rPr>
+      </w:pPr>
+      <w:r>
+        <w:rPr>
+          <w:color w:val="FF0000"/>
+        </w:rPr>
         <w:t>formulaire incomplet.</w:t>
       </w:r>
     </w:p>
@@ -4646,8 +4704,6 @@
       <w:pPr>
         <w:spacing w:after="130"/>
       </w:pPr>
-      <w:bookmarkStart w:id="0" w:name="_GoBack"/>
-      <w:bookmarkEnd w:id="0"/>
       <w:r>
         <w:t xml:space="preserve">La table </w:t>
       </w:r>

</xml_diff>